<commit_message>
added self review document
</commit_message>
<xml_diff>
--- a/Weekly Logs/Matt/Matt Baker - Week 13 Individual Logbook.docx
+++ b/Weekly Logs/Matt/Matt Baker - Week 13 Individual Logbook.docx
@@ -2534,27 +2534,204 @@
       <w:bookmarkEnd w:id="2"/>
     </w:p>
     <w:p>
+      <w:r>
+        <w:t>Tuesday</w:t>
+      </w:r>
+      <w:r>
+        <w:t xml:space="preserve">, </w:t>
+      </w:r>
+      <w:r>
+        <w:t xml:space="preserve">October </w:t>
+      </w:r>
+      <w:r>
+        <w:t>6</w:t>
+      </w:r>
+    </w:p>
+    <w:p>
       <w:pPr>
         <w:rPr>
-          <w:vertAlign w:val="superscript"/>
+          <w:b/>
+          <w:bCs/>
         </w:rPr>
       </w:pPr>
       <w:r>
-        <w:t xml:space="preserve">Monday, </w:t>
-      </w:r>
-      <w:r>
-        <w:t xml:space="preserve">October </w:t>
-      </w:r>
-      <w:r>
-        <w:t>5</w:t>
-      </w:r>
-    </w:p>
-    <w:p>
-      <w:pPr>
         <w:rPr>
-          <w:vertAlign w:val="superscript"/>
+          <w:b/>
+          <w:bCs/>
         </w:rPr>
-      </w:pPr>
+        <w:t>1</w:t>
+      </w:r>
+      <w:r>
+        <w:rPr>
+          <w:b/>
+          <w:bCs/>
+        </w:rPr>
+        <w:t>0</w:t>
+      </w:r>
+      <w:r>
+        <w:rPr>
+          <w:b/>
+          <w:bCs/>
+        </w:rPr>
+        <w:t>:00-1</w:t>
+      </w:r>
+      <w:r>
+        <w:rPr>
+          <w:b/>
+          <w:bCs/>
+        </w:rPr>
+        <w:t>1</w:t>
+      </w:r>
+      <w:r>
+        <w:rPr>
+          <w:b/>
+          <w:bCs/>
+        </w:rPr>
+        <w:t>AM</w:t>
+      </w:r>
+      <w:r>
+        <w:rPr>
+          <w:b/>
+          <w:bCs/>
+        </w:rPr>
+        <w:t xml:space="preserve"> (1hr)</w:t>
+      </w:r>
+    </w:p>
+    <w:p>
+      <w:r>
+        <w:t>Log auditing</w:t>
+      </w:r>
+      <w:r>
+        <w:t xml:space="preserve">, </w:t>
+      </w:r>
+      <w:r>
+        <w:t>assignment</w:t>
+      </w:r>
+      <w:r>
+        <w:t xml:space="preserve"> </w:t>
+      </w:r>
+      <w:r>
+        <w:t>of Dave</w:t>
+      </w:r>
+      <w:r>
+        <w:t xml:space="preserve"> on </w:t>
+      </w:r>
+      <w:r>
+        <w:t xml:space="preserve">closeout client </w:t>
+      </w:r>
+      <w:r>
+        <w:t xml:space="preserve">presentation, </w:t>
+      </w:r>
+      <w:r>
+        <w:t>Sam</w:t>
+      </w:r>
+      <w:r>
+        <w:t xml:space="preserve"> to do research or diagnostics</w:t>
+      </w:r>
+      <w:r>
+        <w:t>. Fixing discrepancy with Sam’s hours in week 12 group log not being up to date.</w:t>
+      </w:r>
+      <w:r>
+        <w:t xml:space="preserve"> Team building </w:t>
+      </w:r>
+      <w:r>
+        <w:t>exercises in</w:t>
+      </w:r>
+      <w:r>
+        <w:t xml:space="preserve"> the form of quizzes.</w:t>
+      </w:r>
+      <w:r>
+        <w:t xml:space="preserve"> </w:t>
+      </w:r>
+    </w:p>
+    <w:p>
+      <w:pPr>
+        <w:rPr>
+          <w:b/>
+          <w:bCs/>
+        </w:rPr>
+      </w:pPr>
+      <w:r>
+        <w:rPr>
+          <w:b/>
+          <w:bCs/>
+        </w:rPr>
+        <w:t xml:space="preserve">5:30 </w:t>
+      </w:r>
+      <w:r>
+        <w:rPr>
+          <w:b/>
+          <w:bCs/>
+        </w:rPr>
+        <w:t>–</w:t>
+      </w:r>
+      <w:r>
+        <w:rPr>
+          <w:b/>
+          <w:bCs/>
+        </w:rPr>
+        <w:t xml:space="preserve"> </w:t>
+      </w:r>
+      <w:r>
+        <w:rPr>
+          <w:b/>
+          <w:bCs/>
+        </w:rPr>
+        <w:t>6:30 (1hr)</w:t>
+      </w:r>
+    </w:p>
+    <w:p>
+      <w:r>
+        <w:t>Meeting with Dave</w:t>
+      </w:r>
+      <w:r>
+        <w:t xml:space="preserve"> and Sam</w:t>
+      </w:r>
+      <w:r>
+        <w:t xml:space="preserve"> reading over entire </w:t>
+      </w:r>
+      <w:r>
+        <w:t>self-review</w:t>
+      </w:r>
+      <w:r>
+        <w:t xml:space="preserve"> document, discussing logging everything that needs doing.</w:t>
+      </w:r>
+      <w:r>
+        <w:t xml:space="preserve"> Some typos were </w:t>
+      </w:r>
+      <w:proofErr w:type="gramStart"/>
+      <w:r>
+        <w:t>located,</w:t>
+      </w:r>
+      <w:proofErr w:type="gramEnd"/>
+      <w:r>
+        <w:t xml:space="preserve"> we discussed </w:t>
+      </w:r>
+      <w:r>
+        <w:t>whether</w:t>
+      </w:r>
+      <w:r>
+        <w:t xml:space="preserve"> the narratives suggested were accurate. We discussed how th</w:t>
+      </w:r>
+      <w:r>
+        <w:t xml:space="preserve">e shift in project scope </w:t>
+      </w:r>
+      <w:proofErr w:type="gramStart"/>
+      <w:r>
+        <w:t>/”philosophy</w:t>
+      </w:r>
+      <w:proofErr w:type="gramEnd"/>
+      <w:r>
+        <w:t xml:space="preserve">” changes how the </w:t>
+      </w:r>
+      <w:proofErr w:type="spellStart"/>
+      <w:r>
+        <w:t>gantt</w:t>
+      </w:r>
+      <w:proofErr w:type="spellEnd"/>
+      <w:r>
+        <w:t xml:space="preserve"> chart is interpreted.</w:t>
+      </w:r>
     </w:p>
     <w:p>
       <w:pPr>
@@ -2583,6 +2760,172 @@
         <w:t>or Meetings</w:t>
       </w:r>
       <w:bookmarkEnd w:id="3"/>
+    </w:p>
+    <w:p>
+      <w:r>
+        <w:t>Tuesday, October 6</w:t>
+      </w:r>
+    </w:p>
+    <w:p>
+      <w:pPr>
+        <w:rPr>
+          <w:b/>
+          <w:bCs/>
+        </w:rPr>
+      </w:pPr>
+      <w:r>
+        <w:rPr>
+          <w:b/>
+          <w:bCs/>
+        </w:rPr>
+        <w:t>9:00</w:t>
+      </w:r>
+      <w:r>
+        <w:rPr>
+          <w:b/>
+          <w:bCs/>
+        </w:rPr>
+        <w:t xml:space="preserve"> </w:t>
+      </w:r>
+      <w:r>
+        <w:rPr>
+          <w:b/>
+          <w:bCs/>
+        </w:rPr>
+        <w:t>-</w:t>
+      </w:r>
+      <w:r>
+        <w:rPr>
+          <w:b/>
+          <w:bCs/>
+        </w:rPr>
+        <w:t xml:space="preserve"> 1</w:t>
+      </w:r>
+      <w:r>
+        <w:rPr>
+          <w:b/>
+          <w:bCs/>
+        </w:rPr>
+        <w:t>0</w:t>
+      </w:r>
+      <w:r>
+        <w:rPr>
+          <w:b/>
+          <w:bCs/>
+        </w:rPr>
+        <w:t>:00</w:t>
+      </w:r>
+      <w:r>
+        <w:rPr>
+          <w:b/>
+          <w:bCs/>
+        </w:rPr>
+        <w:t>AM</w:t>
+      </w:r>
+      <w:r>
+        <w:rPr>
+          <w:b/>
+          <w:bCs/>
+        </w:rPr>
+        <w:t xml:space="preserve"> (1hr)</w:t>
+      </w:r>
+    </w:p>
+    <w:p>
+      <w:r>
+        <w:t xml:space="preserve">Meeting with </w:t>
+      </w:r>
+      <w:r>
+        <w:t>B</w:t>
+      </w:r>
+      <w:r>
+        <w:t>ryce with all present</w:t>
+      </w:r>
+      <w:r>
+        <w:t xml:space="preserve">, </w:t>
+      </w:r>
+      <w:r>
+        <w:t xml:space="preserve">discussing what panellists are looking for, why Nmap and Wireshark are forensics tools. Setting up </w:t>
+      </w:r>
+      <w:r>
+        <w:t xml:space="preserve">packet sniffing, shadow devices, projects for CV, </w:t>
+      </w:r>
+      <w:r>
+        <w:t>small computers (</w:t>
+      </w:r>
+      <w:r>
+        <w:t>raspberry</w:t>
+      </w:r>
+      <w:r>
+        <w:t xml:space="preserve"> pi…)</w:t>
+      </w:r>
+      <w:r>
+        <w:t>.</w:t>
+      </w:r>
+      <w:r>
+        <w:t xml:space="preserve"> Purchasing second hand technology, (NUC and whatnot)</w:t>
+      </w:r>
+      <w:r>
+        <w:t>. Final video</w:t>
+      </w:r>
+      <w:r>
+        <w:t xml:space="preserve"> </w:t>
+      </w:r>
+      <w:r>
+        <w:t>presentation to panel. Applying for jobs, outrageous employer expectations or even undisclosed expectations.</w:t>
+      </w:r>
+      <w:r>
+        <w:t xml:space="preserve"> </w:t>
+      </w:r>
+      <w:r>
+        <w:t>Drawing</w:t>
+      </w:r>
+      <w:r>
+        <w:t xml:space="preserve"> flowcharts, what important steps to include</w:t>
+      </w:r>
+      <w:r>
+        <w:t xml:space="preserve"> in AI processing.</w:t>
+      </w:r>
+      <w:r>
+        <w:t xml:space="preserve"> Testing, how did we validate our output.</w:t>
+      </w:r>
+      <w:r>
+        <w:t xml:space="preserve"> Create graphs that represent the changes in tokens, required processing power, and increase in time it took to generate reports</w:t>
+      </w:r>
+      <w:r>
+        <w:t xml:space="preserve"> between pre and post 30k context length</w:t>
+      </w:r>
+      <w:r>
+        <w:t>.</w:t>
+      </w:r>
+      <w:r>
+        <w:t xml:space="preserve"> </w:t>
+      </w:r>
+      <w:r>
+        <w:t xml:space="preserve">Install </w:t>
+      </w:r>
+      <w:proofErr w:type="spellStart"/>
+      <w:r>
+        <w:t>sys</w:t>
+      </w:r>
+      <w:r>
+        <w:t>s</w:t>
+      </w:r>
+      <w:r>
+        <w:t>tat</w:t>
+      </w:r>
+      <w:proofErr w:type="spellEnd"/>
+      <w:r>
+        <w:t xml:space="preserve"> for more computation metrics.</w:t>
+      </w:r>
+      <w:r>
+        <w:t xml:space="preserve"> Include idle baseline.</w:t>
+      </w:r>
+      <w:r>
+        <w:t xml:space="preserve"> Create a presentation.</w:t>
+      </w:r>
+      <w:r>
+        <w:t xml:space="preserve"> </w:t>
+      </w:r>
     </w:p>
     <w:p>
       <w:pPr>
@@ -2664,6 +3007,13 @@
           <w:b/>
           <w:bCs/>
         </w:rPr>
+        <w:t>mins</w:t>
+      </w:r>
+      <w:r>
+        <w:rPr>
+          <w:b/>
+          <w:bCs/>
+        </w:rPr>
         <w:t>)</w:t>
       </w:r>
     </w:p>
@@ -2676,6 +3026,223 @@
       </w:r>
       <w:r>
         <w:t>Completed a Wireshark dataset findings section and discussion as well as a table of all test cases, source file types, and converted file types.</w:t>
+      </w:r>
+    </w:p>
+    <w:p>
+      <w:r>
+        <w:t>Tuesday, October 6</w:t>
+      </w:r>
+    </w:p>
+    <w:p>
+      <w:pPr>
+        <w:rPr>
+          <w:b/>
+          <w:bCs/>
+        </w:rPr>
+      </w:pPr>
+      <w:r>
+        <w:rPr>
+          <w:b/>
+          <w:bCs/>
+        </w:rPr>
+        <w:t xml:space="preserve">12:00 </w:t>
+      </w:r>
+      <w:r>
+        <w:rPr>
+          <w:b/>
+          <w:bCs/>
+        </w:rPr>
+        <w:t>–</w:t>
+      </w:r>
+      <w:r>
+        <w:rPr>
+          <w:b/>
+          <w:bCs/>
+        </w:rPr>
+        <w:t xml:space="preserve"> </w:t>
+      </w:r>
+      <w:r>
+        <w:rPr>
+          <w:b/>
+          <w:bCs/>
+        </w:rPr>
+        <w:t>4:00 (4 hrs)</w:t>
+      </w:r>
+    </w:p>
+    <w:p>
+      <w:r>
+        <w:t xml:space="preserve">Work on </w:t>
+      </w:r>
+      <w:r>
+        <w:t>self-management</w:t>
+      </w:r>
+      <w:r>
+        <w:t xml:space="preserve"> review</w:t>
+      </w:r>
+      <w:r>
+        <w:t xml:space="preserve">. First settling </w:t>
+      </w:r>
+      <w:r>
+        <w:t xml:space="preserve">the word document as a shared </w:t>
+      </w:r>
+      <w:r>
+        <w:t>OneDrive</w:t>
+      </w:r>
+      <w:r>
+        <w:t xml:space="preserve"> document so that changes are attributable and people don’t have to use </w:t>
+      </w:r>
+      <w:r>
+        <w:t>web</w:t>
+      </w:r>
+      <w:r>
+        <w:t xml:space="preserve"> browser version of word to modify the document. Added cover page.</w:t>
+      </w:r>
+      <w:r>
+        <w:t xml:space="preserve"> Added all evidence to appendices list and cross referenced them to the related content in the discussion sections. Added all individual logbook evidence and discussion into the document, formatting appropriately.</w:t>
+      </w:r>
+      <w:r>
+        <w:t xml:space="preserve"> Created and added headings for all weekly </w:t>
+      </w:r>
+      <w:r>
+        <w:lastRenderedPageBreak/>
+        <w:t>logbook evidence so that they wouldn’t link to the table of contents and bloat it. Also set all “Experience, reflection, action headings to one for the same reason.</w:t>
+      </w:r>
+    </w:p>
+    <w:p/>
+    <w:p>
+      <w:pPr>
+        <w:rPr>
+          <w:b/>
+          <w:bCs/>
+        </w:rPr>
+      </w:pPr>
+      <w:r>
+        <w:rPr>
+          <w:b/>
+          <w:bCs/>
+        </w:rPr>
+        <w:t xml:space="preserve">5:00 </w:t>
+      </w:r>
+      <w:r>
+        <w:rPr>
+          <w:b/>
+          <w:bCs/>
+        </w:rPr>
+        <w:t>–</w:t>
+      </w:r>
+      <w:r>
+        <w:rPr>
+          <w:b/>
+          <w:bCs/>
+        </w:rPr>
+        <w:t xml:space="preserve"> </w:t>
+      </w:r>
+      <w:r>
+        <w:rPr>
+          <w:b/>
+          <w:bCs/>
+        </w:rPr>
+        <w:t>5:30 (30mins)</w:t>
+      </w:r>
+    </w:p>
+    <w:p>
+      <w:r>
+        <w:t>Continuing previously logged work after my penetration testing lecture. Particularly formatting the rest of ERA headings to heading 4 and adding Olivia’s discussion and logbook evidence content</w:t>
+      </w:r>
+      <w:r>
+        <w:t xml:space="preserve"> and cross referencing it</w:t>
+      </w:r>
+      <w:r>
+        <w:t>.</w:t>
+      </w:r>
+    </w:p>
+    <w:p>
+      <w:pPr>
+        <w:ind w:left="0" w:firstLine="0"/>
+      </w:pPr>
+      <w:r>
+        <w:t>Wednesday, October 7</w:t>
+      </w:r>
+    </w:p>
+    <w:p>
+      <w:pPr>
+        <w:ind w:left="0" w:firstLine="0"/>
+        <w:rPr>
+          <w:b/>
+          <w:bCs/>
+        </w:rPr>
+      </w:pPr>
+      <w:r>
+        <w:rPr>
+          <w:b/>
+          <w:bCs/>
+        </w:rPr>
+        <w:t xml:space="preserve">10:15 - </w:t>
+      </w:r>
+    </w:p>
+    <w:p>
+      <w:r>
+        <w:t>Final touches, editing, structuring, adding lack</w:t>
+      </w:r>
+      <w:r>
+        <w:t>ing</w:t>
+      </w:r>
+      <w:r>
+        <w:t xml:space="preserve"> content to</w:t>
+      </w:r>
+      <w:r>
+        <w:t xml:space="preserve"> many sections</w:t>
+      </w:r>
+      <w:r>
+        <w:t xml:space="preserve"> the </w:t>
+      </w:r>
+      <w:r>
+        <w:t>self-management</w:t>
+      </w:r>
+      <w:r>
+        <w:t xml:space="preserve"> review.</w:t>
+      </w:r>
+      <w:r>
+        <w:t xml:space="preserve"> Changed font everywhere other than the appendices to times new roman 12pt justified</w:t>
+      </w:r>
+      <w:r>
+        <w:t xml:space="preserve"> with</w:t>
+      </w:r>
+      <w:r>
+        <w:t xml:space="preserve"> </w:t>
+      </w:r>
+      <w:proofErr w:type="gramStart"/>
+      <w:r>
+        <w:t>1.15 line</w:t>
+      </w:r>
+      <w:proofErr w:type="gramEnd"/>
+      <w:r>
+        <w:t xml:space="preserve"> spacing.</w:t>
+      </w:r>
+      <w:r>
+        <w:t xml:space="preserve"> Removing </w:t>
+      </w:r>
+      <w:r>
+        <w:t xml:space="preserve">some concatenations. A document exists where my specific in text changes </w:t>
+      </w:r>
+      <w:proofErr w:type="gramStart"/>
+      <w:r>
+        <w:t>are</w:t>
+      </w:r>
+      <w:proofErr w:type="gramEnd"/>
+      <w:r>
+        <w:t xml:space="preserve"> commented on by me to </w:t>
+      </w:r>
+      <w:proofErr w:type="gramStart"/>
+      <w:r>
+        <w:t>validate</w:t>
+      </w:r>
+      <w:proofErr w:type="gramEnd"/>
+      <w:r>
+        <w:t xml:space="preserve"> they were done by me.</w:t>
+      </w:r>
+      <w:r>
+        <w:t xml:space="preserve"> Shifted around sections with headings and appendices so they all start on their own page.</w:t>
       </w:r>
     </w:p>
     <w:p>

</xml_diff>

<commit_message>
added logo concepts and logos folder
</commit_message>
<xml_diff>
--- a/Weekly Logs/Matt/Matt Baker - Week 13 Individual Logbook.docx
+++ b/Weekly Logs/Matt/Matt Baker - Week 13 Individual Logbook.docx
@@ -2152,7 +2152,7 @@
               <w:ind w:left="0" w:firstLine="0"/>
             </w:pPr>
             <w:r>
-              <w:t>16hrs</w:t>
+              <w:t>18hrs 45min</w:t>
             </w:r>
           </w:p>
         </w:tc>
@@ -2364,6 +2364,9 @@
             <w:pPr>
               <w:spacing w:after="0" w:line="259" w:lineRule="auto"/>
             </w:pPr>
+            <w:r>
+              <w:t>30hrs 15 min</w:t>
+            </w:r>
           </w:p>
         </w:tc>
       </w:tr>
@@ -2439,7 +2442,25 @@
               <w:rPr>
                 <w:sz w:val="24"/>
               </w:rPr>
-              <w:t>309</w:t>
+              <w:t>3</w:t>
+            </w:r>
+            <w:r>
+              <w:rPr>
+                <w:sz w:val="24"/>
+              </w:rPr>
+              <w:t>3</w:t>
+            </w:r>
+            <w:r>
+              <w:rPr>
+                <w:sz w:val="24"/>
+              </w:rPr>
+              <w:t>9</w:t>
+            </w:r>
+            <w:r>
+              <w:rPr>
+                <w:sz w:val="24"/>
+              </w:rPr>
+              <w:t>hrs 15min</w:t>
             </w:r>
             <w:r>
               <w:rPr>
@@ -2706,15 +2727,7 @@
         <w:t xml:space="preserve"> document, discussing logging everything that needs doing.</w:t>
       </w:r>
       <w:r>
-        <w:t xml:space="preserve"> Some typos were </w:t>
-      </w:r>
-      <w:proofErr w:type="gramStart"/>
-      <w:r>
-        <w:t>located,</w:t>
-      </w:r>
-      <w:proofErr w:type="gramEnd"/>
-      <w:r>
-        <w:t xml:space="preserve"> we discussed </w:t>
+        <w:t xml:space="preserve"> Some typos were located, we discussed </w:t>
       </w:r>
       <w:r>
         <w:t>whether</w:t>
@@ -2723,23 +2736,7 @@
         <w:t xml:space="preserve"> the narratives suggested were accurate. We discussed how th</w:t>
       </w:r>
       <w:r>
-        <w:t xml:space="preserve">e shift in project scope </w:t>
-      </w:r>
-      <w:proofErr w:type="gramStart"/>
-      <w:r>
-        <w:t>/”philosophy</w:t>
-      </w:r>
-      <w:proofErr w:type="gramEnd"/>
-      <w:r>
-        <w:t xml:space="preserve">” changes how the </w:t>
-      </w:r>
-      <w:proofErr w:type="spellStart"/>
-      <w:r>
-        <w:t>gantt</w:t>
-      </w:r>
-      <w:proofErr w:type="spellEnd"/>
-      <w:r>
-        <w:t xml:space="preserve"> chart is interpreted.</w:t>
+        <w:t>e shift in project scope /”philosophy” changes how the gantt chart is interpreted.</w:t>
       </w:r>
     </w:p>
     <w:p>
@@ -2910,21 +2907,13 @@
         <w:t xml:space="preserve"> </w:t>
       </w:r>
       <w:r>
-        <w:t xml:space="preserve">Install </w:t>
-      </w:r>
-      <w:proofErr w:type="spellStart"/>
-      <w:r>
-        <w:t>sys</w:t>
+        <w:t>Install sys</w:t>
       </w:r>
       <w:r>
         <w:t>s</w:t>
       </w:r>
       <w:r>
-        <w:t>tat</w:t>
-      </w:r>
-      <w:proofErr w:type="spellEnd"/>
-      <w:r>
-        <w:t xml:space="preserve"> for more computation metrics.</w:t>
+        <w:t>tat for more computation metrics.</w:t>
       </w:r>
       <w:r>
         <w:t xml:space="preserve"> Include idle baseline.</w:t>
@@ -3357,37 +3346,13 @@
         <w:t xml:space="preserve"> with</w:t>
       </w:r>
       <w:r>
-        <w:t xml:space="preserve"> </w:t>
-      </w:r>
-      <w:proofErr w:type="gramStart"/>
-      <w:r>
-        <w:t>1.15 line</w:t>
-      </w:r>
-      <w:proofErr w:type="gramEnd"/>
-      <w:r>
-        <w:t xml:space="preserve"> spacing.</w:t>
+        <w:t xml:space="preserve"> 1.15 line spacing.</w:t>
       </w:r>
       <w:r>
         <w:t xml:space="preserve"> Removing </w:t>
       </w:r>
       <w:r>
-        <w:t xml:space="preserve">some concatenations. A document exists where my specific in text changes </w:t>
-      </w:r>
-      <w:proofErr w:type="gramStart"/>
-      <w:r>
-        <w:t>are</w:t>
-      </w:r>
-      <w:proofErr w:type="gramEnd"/>
-      <w:r>
-        <w:t xml:space="preserve"> commented on by me to </w:t>
-      </w:r>
-      <w:proofErr w:type="gramStart"/>
-      <w:r>
-        <w:t>validate</w:t>
-      </w:r>
-      <w:proofErr w:type="gramEnd"/>
-      <w:r>
-        <w:t xml:space="preserve"> they were done by me.</w:t>
+        <w:t>some concatenations. A document exists where my specific in text changes are commented on by me to validate they were done by me.</w:t>
       </w:r>
       <w:r>
         <w:t xml:space="preserve"> Shifted around sections with headings and appendices so they all start on their own page.</w:t>
@@ -3451,13 +3416,8 @@
     </w:p>
     <w:p>
       <w:r>
-        <w:t xml:space="preserve">Using a simple script to capture live GPU data with </w:t>
-      </w:r>
-      <w:proofErr w:type="spellStart"/>
-      <w:r>
-        <w:t>smi</w:t>
-      </w:r>
-      <w:proofErr w:type="spellEnd"/>
+        <w:t>Using a simple script to capture live GPU data with smi</w:t>
+      </w:r>
       <w:r>
         <w:t xml:space="preserve"> and appending it to a file, stopping the capture once the script has finished.</w:t>
       </w:r>
@@ -3553,26 +3513,10 @@
     </w:p>
     <w:p>
       <w:r>
-        <w:t xml:space="preserve">This data will be used by </w:t>
-      </w:r>
-      <w:proofErr w:type="spellStart"/>
-      <w:r>
-        <w:t>sam</w:t>
-      </w:r>
-      <w:proofErr w:type="spellEnd"/>
-      <w:r>
-        <w:t xml:space="preserve"> to average out the GPU statistics.</w:t>
-      </w:r>
-      <w:r>
-        <w:t xml:space="preserve"> But during this </w:t>
-      </w:r>
-      <w:proofErr w:type="gramStart"/>
-      <w:r>
-        <w:t>time</w:t>
-      </w:r>
-      <w:proofErr w:type="gramEnd"/>
-      <w:r>
-        <w:t xml:space="preserve"> I recorded all other statistics and ran the script for every test case for every tool 3 times. </w:t>
+        <w:t>This data will be used by sam to average out the GPU statistics.</w:t>
+      </w:r>
+      <w:r>
+        <w:t xml:space="preserve"> But during this time I recorded all other statistics and ran the script for every test case for every tool 3 times. </w:t>
       </w:r>
     </w:p>
     <w:p>
@@ -7610,15 +7554,7 @@
               <w:ind w:left="0" w:firstLine="0"/>
             </w:pPr>
             <w:r>
-              <w:t>Time (</w:t>
-            </w:r>
-            <w:proofErr w:type="spellStart"/>
-            <w:r>
-              <w:t>avg</w:t>
-            </w:r>
-            <w:proofErr w:type="spellEnd"/>
-            <w:r>
-              <w:t>)</w:t>
+              <w:t>Time (avg)</w:t>
             </w:r>
           </w:p>
         </w:tc>
@@ -7639,15 +7575,7 @@
               <w:ind w:left="0" w:firstLine="0"/>
             </w:pPr>
             <w:r>
-              <w:t>(</w:t>
-            </w:r>
-            <w:proofErr w:type="spellStart"/>
-            <w:r>
-              <w:t>avg</w:t>
-            </w:r>
-            <w:proofErr w:type="spellEnd"/>
-            <w:r>
-              <w:t>)</w:t>
+              <w:t>(avg)</w:t>
             </w:r>
           </w:p>
         </w:tc>
@@ -7668,15 +7596,7 @@
               <w:ind w:left="0" w:firstLine="0"/>
             </w:pPr>
             <w:r>
-              <w:t>(</w:t>
-            </w:r>
-            <w:proofErr w:type="spellStart"/>
-            <w:r>
-              <w:t>avg</w:t>
-            </w:r>
-            <w:proofErr w:type="spellEnd"/>
-            <w:r>
-              <w:t>)</w:t>
+              <w:t>(avg)</w:t>
             </w:r>
           </w:p>
         </w:tc>
@@ -7697,15 +7617,7 @@
               <w:ind w:left="0" w:firstLine="0"/>
             </w:pPr>
             <w:r>
-              <w:t>(</w:t>
-            </w:r>
-            <w:proofErr w:type="spellStart"/>
-            <w:r>
-              <w:t>avg</w:t>
-            </w:r>
-            <w:proofErr w:type="spellEnd"/>
-            <w:r>
-              <w:t>)</w:t>
+              <w:t>(avg)</w:t>
             </w:r>
           </w:p>
         </w:tc>
@@ -8118,16 +8030,11 @@
       <w:r>
         <w:t>Metrics gathered during AI report generation for Nmap data (</w:t>
       </w:r>
-      <w:proofErr w:type="spellStart"/>
       <w:r>
         <w:t>n</w:t>
       </w:r>
       <w:r>
-        <w:t>map</w:t>
-      </w:r>
-      <w:proofErr w:type="spellEnd"/>
-      <w:r>
-        <w:t xml:space="preserve"> scans).</w:t>
+        <w:t>map scans).</w:t>
       </w:r>
     </w:p>
     <w:p>
@@ -8176,15 +8083,7 @@
               <w:ind w:left="0" w:firstLine="0"/>
             </w:pPr>
             <w:r>
-              <w:t>Time (</w:t>
-            </w:r>
-            <w:proofErr w:type="spellStart"/>
-            <w:r>
-              <w:t>avg</w:t>
-            </w:r>
-            <w:proofErr w:type="spellEnd"/>
-            <w:r>
-              <w:t>)</w:t>
+              <w:t>Time (avg)</w:t>
             </w:r>
           </w:p>
         </w:tc>
@@ -8197,15 +8096,7 @@
               <w:ind w:left="0" w:firstLine="0"/>
             </w:pPr>
             <w:r>
-              <w:t>Input Tokens (</w:t>
-            </w:r>
-            <w:proofErr w:type="spellStart"/>
-            <w:r>
-              <w:t>avg</w:t>
-            </w:r>
-            <w:proofErr w:type="spellEnd"/>
-            <w:r>
-              <w:t>)</w:t>
+              <w:t>Input Tokens (avg)</w:t>
             </w:r>
           </w:p>
         </w:tc>
@@ -8218,15 +8109,7 @@
               <w:ind w:left="0" w:firstLine="0"/>
             </w:pPr>
             <w:r>
-              <w:t>Output Tokens (</w:t>
-            </w:r>
-            <w:proofErr w:type="spellStart"/>
-            <w:r>
-              <w:t>avg</w:t>
-            </w:r>
-            <w:proofErr w:type="spellEnd"/>
-            <w:r>
-              <w:t>)</w:t>
+              <w:t>Output Tokens (avg)</w:t>
             </w:r>
           </w:p>
         </w:tc>
@@ -8239,15 +8122,7 @@
               <w:ind w:left="0" w:firstLine="0"/>
             </w:pPr>
             <w:r>
-              <w:t>Total Tokens (</w:t>
-            </w:r>
-            <w:proofErr w:type="spellStart"/>
-            <w:r>
-              <w:t>avg</w:t>
-            </w:r>
-            <w:proofErr w:type="spellEnd"/>
-            <w:r>
-              <w:t>)</w:t>
+              <w:t>Total Tokens (avg)</w:t>
             </w:r>
           </w:p>
         </w:tc>
@@ -8718,15 +8593,7 @@
               <w:ind w:left="0" w:firstLine="0"/>
             </w:pPr>
             <w:r>
-              <w:t>Time (</w:t>
-            </w:r>
-            <w:proofErr w:type="spellStart"/>
-            <w:r>
-              <w:t>avg</w:t>
-            </w:r>
-            <w:proofErr w:type="spellEnd"/>
-            <w:r>
-              <w:t>)</w:t>
+              <w:t>Time (avg)</w:t>
             </w:r>
           </w:p>
         </w:tc>
@@ -8739,15 +8606,7 @@
               <w:ind w:left="0" w:firstLine="0"/>
             </w:pPr>
             <w:r>
-              <w:t>Input Tokens (</w:t>
-            </w:r>
-            <w:proofErr w:type="spellStart"/>
-            <w:r>
-              <w:t>avg</w:t>
-            </w:r>
-            <w:proofErr w:type="spellEnd"/>
-            <w:r>
-              <w:t>)</w:t>
+              <w:t>Input Tokens (avg)</w:t>
             </w:r>
           </w:p>
         </w:tc>
@@ -8760,15 +8619,7 @@
               <w:ind w:left="0" w:firstLine="0"/>
             </w:pPr>
             <w:r>
-              <w:t>Output Tokens (</w:t>
-            </w:r>
-            <w:proofErr w:type="spellStart"/>
-            <w:r>
-              <w:t>avg</w:t>
-            </w:r>
-            <w:proofErr w:type="spellEnd"/>
-            <w:r>
-              <w:t>)</w:t>
+              <w:t>Output Tokens (avg)</w:t>
             </w:r>
           </w:p>
         </w:tc>
@@ -8781,15 +8632,7 @@
               <w:ind w:left="0" w:firstLine="0"/>
             </w:pPr>
             <w:r>
-              <w:t>Total Tokens (</w:t>
-            </w:r>
-            <w:proofErr w:type="spellStart"/>
-            <w:r>
-              <w:t>avg</w:t>
-            </w:r>
-            <w:proofErr w:type="spellEnd"/>
-            <w:r>
-              <w:t>)</w:t>
+              <w:t>Total Tokens (avg)</w:t>
             </w:r>
           </w:p>
         </w:tc>
@@ -9539,6 +9382,9 @@
         <w:ind w:left="0" w:firstLine="0"/>
       </w:pPr>
       <w:r>
+        <w:rPr>
+          <w:noProof/>
+        </w:rPr>
         <w:drawing>
           <wp:inline distT="0" distB="0" distL="0" distR="0" wp14:anchorId="21ABE8DB" wp14:editId="4A968503">
             <wp:extent cx="3183147" cy="4055927"/>
@@ -9625,6 +9471,9 @@
         <w:ind w:left="0" w:firstLine="0"/>
       </w:pPr>
       <w:r>
+        <w:rPr>
+          <w:noProof/>
+        </w:rPr>
         <w:drawing>
           <wp:inline distT="0" distB="0" distL="0" distR="0" wp14:anchorId="713C6460" wp14:editId="395D9B10">
             <wp:extent cx="5729605" cy="3803015"/>
@@ -9665,155 +9514,6 @@
     <w:p>
       <w:pPr>
         <w:ind w:left="0" w:firstLine="0"/>
-      </w:pPr>
-    </w:p>
-    <w:p>
-      <w:pPr>
-        <w:ind w:left="0" w:firstLine="0"/>
-      </w:pPr>
-    </w:p>
-    <w:p>
-      <w:pPr>
-        <w:ind w:left="0" w:firstLine="0"/>
-      </w:pPr>
-    </w:p>
-    <w:p>
-      <w:pPr>
-        <w:ind w:left="0" w:firstLine="0"/>
-      </w:pPr>
-    </w:p>
-    <w:p>
-      <w:pPr>
-        <w:ind w:left="0" w:firstLine="0"/>
-      </w:pPr>
-    </w:p>
-    <w:p>
-      <w:pPr>
-        <w:ind w:left="0" w:firstLine="0"/>
-      </w:pPr>
-    </w:p>
-    <w:p>
-      <w:pPr>
-        <w:ind w:left="0" w:firstLine="0"/>
-      </w:pPr>
-    </w:p>
-    <w:p>
-      <w:pPr>
-        <w:ind w:left="0" w:firstLine="0"/>
-      </w:pPr>
-    </w:p>
-    <w:p>
-      <w:pPr>
-        <w:ind w:left="0" w:firstLine="0"/>
-      </w:pPr>
-    </w:p>
-    <w:p>
-      <w:pPr>
-        <w:ind w:left="0" w:firstLine="0"/>
-      </w:pPr>
-    </w:p>
-    <w:p>
-      <w:pPr>
-        <w:ind w:left="0" w:firstLine="0"/>
-      </w:pPr>
-    </w:p>
-    <w:p>
-      <w:pPr>
-        <w:ind w:left="0" w:firstLine="0"/>
-      </w:pPr>
-    </w:p>
-    <w:p>
-      <w:pPr>
-        <w:ind w:left="0" w:firstLine="0"/>
-      </w:pPr>
-    </w:p>
-    <w:p>
-      <w:pPr>
-        <w:ind w:left="0" w:firstLine="0"/>
-      </w:pPr>
-    </w:p>
-    <w:p>
-      <w:pPr>
-        <w:ind w:left="0" w:firstLine="0"/>
-      </w:pPr>
-    </w:p>
-    <w:p>
-      <w:pPr>
-        <w:ind w:left="0" w:firstLine="0"/>
-      </w:pPr>
-    </w:p>
-    <w:p>
-      <w:pPr>
-        <w:ind w:left="0" w:firstLine="0"/>
-      </w:pPr>
-    </w:p>
-    <w:p>
-      <w:pPr>
-        <w:ind w:left="0" w:firstLine="0"/>
-      </w:pPr>
-    </w:p>
-    <w:p>
-      <w:pPr>
-        <w:ind w:left="0" w:firstLine="0"/>
-      </w:pPr>
-    </w:p>
-    <w:p>
-      <w:pPr>
-        <w:ind w:left="0" w:firstLine="0"/>
-      </w:pPr>
-    </w:p>
-    <w:p>
-      <w:pPr>
-        <w:ind w:left="0" w:firstLine="0"/>
-      </w:pPr>
-    </w:p>
-    <w:p>
-      <w:pPr>
-        <w:ind w:left="0" w:firstLine="0"/>
-      </w:pPr>
-    </w:p>
-    <w:p>
-      <w:pPr>
-        <w:ind w:left="0" w:firstLine="0"/>
-      </w:pPr>
-    </w:p>
-    <w:p>
-      <w:pPr>
-        <w:ind w:left="0" w:firstLine="0"/>
-      </w:pPr>
-    </w:p>
-    <w:p>
-      <w:pPr>
-        <w:ind w:left="0" w:firstLine="0"/>
-      </w:pPr>
-    </w:p>
-    <w:p>
-      <w:pPr>
-        <w:ind w:left="0" w:firstLine="0"/>
-      </w:pPr>
-    </w:p>
-    <w:p>
-      <w:pPr>
-        <w:ind w:left="0" w:firstLine="0"/>
-      </w:pPr>
-    </w:p>
-    <w:p>
-      <w:pPr>
-        <w:pStyle w:val="Heading2"/>
-      </w:pPr>
-      <w:bookmarkStart w:id="7" w:name="_Toc242029811"/>
-      <w:r>
-        <w:t>Testing</w:t>
-      </w:r>
-      <w:bookmarkEnd w:id="7"/>
-    </w:p>
-    <w:p>
-      <w:r>
-        <w:t>Wednesday, October 7</w:t>
-      </w:r>
-    </w:p>
-    <w:p>
-      <w:pPr>
         <w:rPr>
           <w:b/>
           <w:bCs/>
@@ -9824,7 +9524,7 @@
           <w:b/>
           <w:bCs/>
         </w:rPr>
-        <w:t xml:space="preserve">6:00 </w:t>
+        <w:t xml:space="preserve">6:45 </w:t>
       </w:r>
       <w:r>
         <w:rPr>
@@ -9845,27 +9545,163 @@
           <w:b/>
           <w:bCs/>
         </w:rPr>
-        <w:t xml:space="preserve">7:30 </w:t>
-      </w:r>
-      <w:r>
+        <w:t>7:00 (15min)</w:t>
+      </w:r>
+    </w:p>
+    <w:p>
+      <w:pPr>
+        <w:ind w:left="0" w:firstLine="0"/>
+      </w:pPr>
+      <w:r>
+        <w:t>Adding remaining data to research report</w:t>
+      </w:r>
+      <w:r>
+        <w:t>.</w:t>
+      </w:r>
+      <w:r>
+        <w:t xml:space="preserve"> </w:t>
+      </w:r>
+    </w:p>
+    <w:p>
+      <w:pPr>
+        <w:ind w:left="0" w:firstLine="0"/>
+      </w:pPr>
+      <w:r>
+        <w:rPr>
+          <w:noProof/>
+        </w:rPr>
+        <w:drawing>
+          <wp:inline distT="0" distB="0" distL="0" distR="0" wp14:anchorId="027323E5" wp14:editId="3DEE673A">
+            <wp:extent cx="5729605" cy="2150110"/>
+            <wp:effectExtent l="0" t="0" r="4445" b="2540"/>
+            <wp:docPr id="337453605" name="Picture 1"/>
+            <wp:cNvGraphicFramePr>
+              <a:graphicFrameLocks xmlns:a="http://schemas.openxmlformats.org/drawingml/2006/main" noChangeAspect="1"/>
+            </wp:cNvGraphicFramePr>
+            <a:graphic xmlns:a="http://schemas.openxmlformats.org/drawingml/2006/main">
+              <a:graphicData uri="http://schemas.openxmlformats.org/drawingml/2006/picture">
+                <pic:pic xmlns:pic="http://schemas.openxmlformats.org/drawingml/2006/picture">
+                  <pic:nvPicPr>
+                    <pic:cNvPr id="337453605" name=""/>
+                    <pic:cNvPicPr/>
+                  </pic:nvPicPr>
+                  <pic:blipFill>
+                    <a:blip r:embed="rId16"/>
+                    <a:stretch>
+                      <a:fillRect/>
+                    </a:stretch>
+                  </pic:blipFill>
+                  <pic:spPr>
+                    <a:xfrm>
+                      <a:off x="0" y="0"/>
+                      <a:ext cx="5729605" cy="2150110"/>
+                    </a:xfrm>
+                    <a:prstGeom prst="rect">
+                      <a:avLst/>
+                    </a:prstGeom>
+                  </pic:spPr>
+                </pic:pic>
+              </a:graphicData>
+            </a:graphic>
+          </wp:inline>
+        </w:drawing>
+      </w:r>
+    </w:p>
+    <w:p>
+      <w:pPr>
+        <w:ind w:left="0" w:firstLine="0"/>
+      </w:pPr>
+    </w:p>
+    <w:p>
+      <w:pPr>
+        <w:ind w:left="0" w:firstLine="0"/>
+      </w:pPr>
+    </w:p>
+    <w:p>
+      <w:pPr>
+        <w:ind w:left="0" w:firstLine="0"/>
+      </w:pPr>
+    </w:p>
+    <w:p>
+      <w:pPr>
+        <w:ind w:left="0" w:firstLine="0"/>
+      </w:pPr>
+    </w:p>
+    <w:p>
+      <w:pPr>
+        <w:ind w:left="0" w:firstLine="0"/>
+      </w:pPr>
+    </w:p>
+    <w:p>
+      <w:pPr>
+        <w:pStyle w:val="Heading2"/>
+      </w:pPr>
+      <w:bookmarkStart w:id="7" w:name="_Toc242029811"/>
+      <w:r>
+        <w:lastRenderedPageBreak/>
+        <w:t>Testing</w:t>
+      </w:r>
+      <w:bookmarkEnd w:id="7"/>
+    </w:p>
+    <w:p>
+      <w:r>
+        <w:t>Wednesday, October 7</w:t>
+      </w:r>
+    </w:p>
+    <w:p>
+      <w:pPr>
         <w:rPr>
           <w:b/>
           <w:bCs/>
         </w:rPr>
-        <w:t>(1hr</w:t>
-      </w:r>
+      </w:pPr>
       <w:r>
         <w:rPr>
           <w:b/>
           <w:bCs/>
         </w:rPr>
-        <w:t xml:space="preserve"> 30mins</w:t>
+        <w:t xml:space="preserve">6:00 </w:t>
       </w:r>
       <w:r>
         <w:rPr>
           <w:b/>
           <w:bCs/>
         </w:rPr>
+        <w:t>–</w:t>
+      </w:r>
+      <w:r>
+        <w:rPr>
+          <w:b/>
+          <w:bCs/>
+        </w:rPr>
+        <w:t xml:space="preserve"> </w:t>
+      </w:r>
+      <w:r>
+        <w:rPr>
+          <w:b/>
+          <w:bCs/>
+        </w:rPr>
+        <w:t xml:space="preserve">7:30 </w:t>
+      </w:r>
+      <w:r>
+        <w:rPr>
+          <w:b/>
+          <w:bCs/>
+        </w:rPr>
+        <w:t>(1hr</w:t>
+      </w:r>
+      <w:r>
+        <w:rPr>
+          <w:b/>
+          <w:bCs/>
+        </w:rPr>
+        <w:t xml:space="preserve"> 30mins</w:t>
+      </w:r>
+      <w:r>
+        <w:rPr>
+          <w:b/>
+          <w:bCs/>
+        </w:rPr>
         <w:t>)</w:t>
       </w:r>
     </w:p>
@@ -9895,7 +9731,6 @@
         <w:rPr>
           <w:noProof/>
         </w:rPr>
-        <w:lastRenderedPageBreak/>
         <w:drawing>
           <wp:inline distT="0" distB="0" distL="0" distR="0" wp14:anchorId="26E3C289" wp14:editId="0AAAC1FD">
             <wp:extent cx="4183166" cy="3964002"/>
@@ -9912,7 +9747,7 @@
                     <pic:cNvPicPr/>
                   </pic:nvPicPr>
                   <pic:blipFill>
-                    <a:blip r:embed="rId16"/>
+                    <a:blip r:embed="rId17"/>
                     <a:stretch>
                       <a:fillRect/>
                     </a:stretch>
@@ -9959,7 +9794,7 @@
                     <pic:cNvPicPr/>
                   </pic:nvPicPr>
                   <pic:blipFill>
-                    <a:blip r:embed="rId17"/>
+                    <a:blip r:embed="rId18"/>
                     <a:stretch>
                       <a:fillRect/>
                     </a:stretch>
@@ -9985,15 +9820,7 @@
     <w:p/>
     <w:p>
       <w:r>
-        <w:t xml:space="preserve">I run a barebones prompt outside of the script on the same data (including with thinking parameter on), asking for just the packet range (1), and it gets it </w:t>
-      </w:r>
-      <w:proofErr w:type="gramStart"/>
-      <w:r>
-        <w:t>correct(</w:t>
-      </w:r>
-      <w:proofErr w:type="gramEnd"/>
-      <w:r>
-        <w:t xml:space="preserve">2). </w:t>
+        <w:t xml:space="preserve">I run a barebones prompt outside of the script on the same data (including with thinking parameter on), asking for just the packet range (1), and it gets it correct(2). </w:t>
       </w:r>
     </w:p>
     <w:p>
@@ -10001,7 +9828,6 @@
         <w:rPr>
           <w:noProof/>
         </w:rPr>
-        <w:lastRenderedPageBreak/>
         <w:drawing>
           <wp:inline distT="0" distB="0" distL="0" distR="0" wp14:anchorId="70B6404C" wp14:editId="1ACDA503">
             <wp:extent cx="5729605" cy="4954905"/>
@@ -10018,7 +9844,7 @@
                     <pic:cNvPicPr/>
                   </pic:nvPicPr>
                   <pic:blipFill>
-                    <a:blip r:embed="rId18"/>
+                    <a:blip r:embed="rId19"/>
                     <a:stretch>
                       <a:fillRect/>
                     </a:stretch>
@@ -10065,7 +9891,7 @@
                     <pic:cNvPicPr/>
                   </pic:nvPicPr>
                   <pic:blipFill>
-                    <a:blip r:embed="rId19"/>
+                    <a:blip r:embed="rId20"/>
                     <a:stretch>
                       <a:fillRect/>
                     </a:stretch>
@@ -10097,7 +9923,6 @@
     </w:p>
     <w:p>
       <w:r>
-        <w:lastRenderedPageBreak/>
         <w:t>I found the limiting factor to be the actual prompt itself, limiting the prompt to just asking for the packet range gave the most accurate result, but still false in this case.</w:t>
       </w:r>
     </w:p>
@@ -10122,7 +9947,7 @@
                     <pic:cNvPicPr/>
                   </pic:nvPicPr>
                   <pic:blipFill>
-                    <a:blip r:embed="rId20"/>
+                    <a:blip r:embed="rId21"/>
                     <a:stretch>
                       <a:fillRect/>
                     </a:stretch>
@@ -10145,15 +9970,7 @@
     </w:p>
     <w:p>
       <w:r>
-        <w:t xml:space="preserve">It is possible </w:t>
-      </w:r>
-      <w:proofErr w:type="spellStart"/>
-      <w:r>
-        <w:t>ollama</w:t>
-      </w:r>
-      <w:proofErr w:type="spellEnd"/>
-      <w:r>
-        <w:t xml:space="preserve"> Is using its memory of previous outcomes to influence the new prompt. As the process is instant if I use the same prompt 2-3 times in a row.</w:t>
+        <w:t>It is possible ollama Is using its memory of previous outcomes to influence the new prompt. As the process is instant if I use the same prompt 2-3 times in a row.</w:t>
       </w:r>
     </w:p>
     <w:p>
@@ -10163,15 +9980,7 @@
     </w:p>
     <w:p>
       <w:r>
-        <w:t>Gemma</w:t>
-      </w:r>
-      <w:proofErr w:type="gramStart"/>
-      <w:r>
-        <w:t>4:latest</w:t>
-      </w:r>
-      <w:proofErr w:type="gramEnd"/>
-      <w:r>
-        <w:t xml:space="preserve"> was able to get the correct range</w:t>
+        <w:t>Gemma4:latest was able to get the correct range</w:t>
       </w:r>
     </w:p>
     <w:p>
@@ -10195,7 +10004,7 @@
                     <pic:cNvPicPr/>
                   </pic:nvPicPr>
                   <pic:blipFill>
-                    <a:blip r:embed="rId21"/>
+                    <a:blip r:embed="rId22"/>
                     <a:stretch>
                       <a:fillRect/>
                     </a:stretch>
@@ -10242,7 +10051,7 @@
                     <pic:cNvPicPr/>
                   </pic:nvPicPr>
                   <pic:blipFill>
-                    <a:blip r:embed="rId22"/>
+                    <a:blip r:embed="rId23"/>
                     <a:stretch>
                       <a:fillRect/>
                     </a:stretch>
@@ -10273,6 +10082,7 @@
         <w:rPr>
           <w:noProof/>
         </w:rPr>
+        <w:lastRenderedPageBreak/>
         <w:drawing>
           <wp:inline distT="0" distB="0" distL="0" distR="0" wp14:anchorId="69D47EA4" wp14:editId="180B47BA">
             <wp:extent cx="5729605" cy="880745"/>
@@ -10289,7 +10099,7 @@
                     <pic:cNvPicPr/>
                   </pic:nvPicPr>
                   <pic:blipFill>
-                    <a:blip r:embed="rId23"/>
+                    <a:blip r:embed="rId24"/>
                     <a:stretch>
                       <a:fillRect/>
                     </a:stretch>
@@ -10318,20 +10128,11 @@
         <w:t xml:space="preserve"> however</w:t>
       </w:r>
       <w:r>
-        <w:t xml:space="preserve"> to identify the packet range for </w:t>
-      </w:r>
-      <w:proofErr w:type="spellStart"/>
-      <w:r>
-        <w:t>xab</w:t>
-      </w:r>
-      <w:proofErr w:type="spellEnd"/>
-      <w:r>
-        <w:t>.</w:t>
-      </w:r>
-    </w:p>
-    <w:p>
-      <w:r>
-        <w:lastRenderedPageBreak/>
+        <w:t xml:space="preserve"> to identify the packet range for xab.</w:t>
+      </w:r>
+    </w:p>
+    <w:p>
+      <w:r>
         <w:t>I also tried converting the data to a token-optimized notation, but it did not reduce its size at all. I will now research PCAP/CSV LLM optimization.</w:t>
       </w:r>
     </w:p>
@@ -10395,28 +10196,12 @@
     </w:p>
     <w:p>
       <w:r>
-        <w:t xml:space="preserve">Creating a new “HammerheadV2” for Wireshark packet captures. This version is the same as </w:t>
-      </w:r>
-      <w:proofErr w:type="gramStart"/>
-      <w:r>
-        <w:t>V1</w:t>
-      </w:r>
-      <w:proofErr w:type="gramEnd"/>
-      <w:r>
-        <w:t xml:space="preserve"> but it attempts to access the full context of the longer PCAP files we have by chunking them into 4 chunks instead of 2.</w:t>
-      </w:r>
-    </w:p>
-    <w:p>
-      <w:r>
-        <w:t xml:space="preserve">How the </w:t>
-      </w:r>
-      <w:proofErr w:type="gramStart"/>
-      <w:r>
-        <w:t>particular problem</w:t>
-      </w:r>
-      <w:proofErr w:type="gramEnd"/>
-      <w:r>
-        <w:t xml:space="preserve"> manifests in the finished reports</w:t>
+        <w:t>Creating a new “HammerheadV2” for Wireshark packet captures. This version is the same as V1 but it attempts to access the full context of the longer PCAP files we have by chunking them into 4 chunks instead of 2.</w:t>
+      </w:r>
+    </w:p>
+    <w:p>
+      <w:r>
+        <w:t>How the particular problem manifests in the finished reports</w:t>
       </w:r>
     </w:p>
     <w:p>
@@ -10441,7 +10226,7 @@
                     <pic:cNvPicPr/>
                   </pic:nvPicPr>
                   <pic:blipFill>
-                    <a:blip r:embed="rId24"/>
+                    <a:blip r:embed="rId25"/>
                     <a:stretch>
                       <a:fillRect/>
                     </a:stretch>
@@ -10471,15 +10256,7 @@
     <w:p/>
     <w:p>
       <w:r>
-        <w:t xml:space="preserve">Inspecting the chunks by themselves it seems some of the analysis prompts are reading a limited quantity of the data still, and in fact it seems worse. It is possible there is something happening like </w:t>
-      </w:r>
-      <w:proofErr w:type="spellStart"/>
-      <w:r>
-        <w:t>Ollama</w:t>
-      </w:r>
-      <w:proofErr w:type="spellEnd"/>
-      <w:r>
-        <w:t xml:space="preserve"> isn’t given enough time to shut down before the next prompt is called.</w:t>
+        <w:t>Inspecting the chunks by themselves it seems some of the analysis prompts are reading a limited quantity of the data still, and in fact it seems worse. It is possible there is something happening like Ollama isn’t given enough time to shut down before the next prompt is called.</w:t>
       </w:r>
     </w:p>
     <w:p>
@@ -10511,7 +10288,7 @@
                     <pic:cNvPicPr/>
                   </pic:nvPicPr>
                   <pic:blipFill>
-                    <a:blip r:embed="rId25"/>
+                    <a:blip r:embed="rId26"/>
                     <a:stretch>
                       <a:fillRect/>
                     </a:stretch>
@@ -10534,23 +10311,7 @@
     </w:p>
     <w:p>
       <w:r>
-        <w:t xml:space="preserve">This is the end of the first chunk of the </w:t>
-      </w:r>
-      <w:proofErr w:type="spellStart"/>
-      <w:r>
-        <w:t>pcap</w:t>
-      </w:r>
-      <w:proofErr w:type="spellEnd"/>
-      <w:r>
-        <w:t xml:space="preserve">, it ends in 3201, meaning </w:t>
-      </w:r>
-      <w:proofErr w:type="spellStart"/>
-      <w:r>
-        <w:t>ollama</w:t>
-      </w:r>
-      <w:proofErr w:type="spellEnd"/>
-      <w:r>
-        <w:t xml:space="preserve"> is only accessing about 200 packets worth of data.</w:t>
+        <w:t>This is the end of the first chunk of the pcap, it ends in 3201, meaning ollama is only accessing about 200 packets worth of data.</w:t>
       </w:r>
     </w:p>
     <w:p>
@@ -10575,7 +10336,7 @@
                     <pic:cNvPicPr/>
                   </pic:nvPicPr>
                   <pic:blipFill>
-                    <a:blip r:embed="rId26"/>
+                    <a:blip r:embed="rId27"/>
                     <a:stretch>
                       <a:fillRect/>
                     </a:stretch>
@@ -10598,50 +10359,10 @@
     </w:p>
     <w:p>
       <w:r>
-        <w:t xml:space="preserve">I realise that the frame time is probably using up a lot of </w:t>
-      </w:r>
-      <w:proofErr w:type="gramStart"/>
-      <w:r>
-        <w:t>context</w:t>
-      </w:r>
-      <w:proofErr w:type="gramEnd"/>
-      <w:r>
-        <w:t xml:space="preserve"> and remove that.</w:t>
-      </w:r>
-      <w:r>
-        <w:t xml:space="preserve"> I also realise scanchunk1 and 3 are looking at the same packet range and fix that. I forgot to change </w:t>
-      </w:r>
-      <w:proofErr w:type="spellStart"/>
-      <w:r>
-        <w:t>xaa</w:t>
-      </w:r>
-      <w:proofErr w:type="spellEnd"/>
-      <w:r>
-        <w:t xml:space="preserve"> to </w:t>
-      </w:r>
-      <w:proofErr w:type="spellStart"/>
-      <w:r>
-        <w:t>xac</w:t>
-      </w:r>
-      <w:proofErr w:type="spellEnd"/>
-      <w:r>
-        <w:t xml:space="preserve"> and </w:t>
-      </w:r>
-      <w:proofErr w:type="spellStart"/>
-      <w:r>
-        <w:t>xab</w:t>
-      </w:r>
-      <w:proofErr w:type="spellEnd"/>
-      <w:r>
-        <w:t xml:space="preserve"> to </w:t>
-      </w:r>
-      <w:proofErr w:type="spellStart"/>
-      <w:r>
-        <w:t>xad</w:t>
-      </w:r>
-      <w:proofErr w:type="spellEnd"/>
-      <w:r>
-        <w:t xml:space="preserve"> for the 2 new passes.</w:t>
+        <w:t>I realise that the frame time is probably using up a lot of context and remove that.</w:t>
+      </w:r>
+      <w:r>
+        <w:t xml:space="preserve"> I also realise scanchunk1 and 3 are looking at the same packet range and fix that. I forgot to change xaa to xac and xab to xad for the 2 new passes.</w:t>
       </w:r>
       <w:r>
         <w:t xml:space="preserve"> I am testing on a simple capture of only 572 packets (evidence01)</w:t>
@@ -10673,7 +10394,7 @@
                     <pic:cNvPicPr/>
                   </pic:nvPicPr>
                   <pic:blipFill>
-                    <a:blip r:embed="rId27"/>
+                    <a:blip r:embed="rId28"/>
                     <a:stretch>
                       <a:fillRect/>
                     </a:stretch>
@@ -10725,7 +10446,7 @@
                     <pic:cNvPicPr/>
                   </pic:nvPicPr>
                   <pic:blipFill>
-                    <a:blip r:embed="rId28"/>
+                    <a:blip r:embed="rId29"/>
                     <a:stretch>
                       <a:fillRect/>
                     </a:stretch>
@@ -10761,10 +10482,10 @@
       </w:pPr>
     </w:p>
     <w:sectPr>
-      <w:headerReference w:type="default" r:id="rId29"/>
-      <w:footerReference w:type="even" r:id="rId30"/>
-      <w:footerReference w:type="default" r:id="rId31"/>
-      <w:footerReference w:type="first" r:id="rId32"/>
+      <w:headerReference w:type="default" r:id="rId30"/>
+      <w:footerReference w:type="even" r:id="rId31"/>
+      <w:footerReference w:type="default" r:id="rId32"/>
+      <w:footerReference w:type="first" r:id="rId33"/>
       <w:pgSz w:w="11906" w:h="16838"/>
       <w:pgMar w:top="1483" w:right="1448" w:bottom="1544" w:left="1435" w:header="720" w:footer="730" w:gutter="0"/>
       <w:pgNumType w:start="0"/>

</xml_diff>